<commit_message>
Reframe future features as Phase 2 upcoming deliverables
Co-Authored-By: Claude Sonnet 4.6 <noreply@anthropic.com>
Claude-Session: https://claude.ai/code/session_01Sbovm5HSrnKCfjWtp3RXYh
</commit_message>
<xml_diff>
--- a/aurogen_entrega.docx
+++ b/aurogen_entrega.docx
@@ -1225,7 +1225,7 @@
           <w:sz w:val="26"/>
           <w:szCs w:val="26"/>
         </w:rPr>
-        <w:t xml:space="preserve">NO INCLUIDO EN ESTA ENTREGA</w:t>
+        <w:t xml:space="preserve">PRÓXIMAS ENTREGAS — FASE 2</w:t>
       </w:r>
     </w:p>
     <w:p>
@@ -1239,7 +1239,7 @@
           <w:sz w:val="22"/>
           <w:szCs w:val="22"/>
         </w:rPr>
-        <w:t xml:space="preserve">Las siguientes funcionalidades requieren integración con servicios de terceros y están cotizadas por separado:</w:t>
+        <w:t xml:space="preserve">Las siguientes funcionalidades están en desarrollo y serán integradas en la siguiente fase del proyecto:</w:t>
       </w:r>
     </w:p>
     <w:p>
@@ -1282,119 +1282,119 @@
                 <w:sz w:val="22"/>
                 <w:szCs w:val="22"/>
               </w:rPr>
-              <w:t xml:space="preserve">Pagos reales (Stripe)</w:t>
-            </w:r>
-          </w:p>
-        </w:tc>
-        <w:tc>
-          <w:tcPr>
-            <w:tcW w:type="dxa" w:w="4320"/>
-            <w:shd w:fill="EFF6FF" w:color="auto" w:val="clear"/>
-          </w:tcPr>
-          <w:p>
-            <w:pPr>
-              <w:spacing w:after="100" w:before="100"/>
-            </w:pPr>
-            <w:r>
-              <w:rPr>
-                <w:rFonts w:ascii="Calibri" w:cs="Calibri" w:eastAsia="Calibri" w:hAnsi="Calibri"/>
-                <w:b w:val="false"/>
-                <w:bCs w:val="false"/>
-                <w:color w:val="111827"/>
-                <w:sz w:val="22"/>
-                <w:szCs w:val="22"/>
-              </w:rPr>
-              <w:t xml:space="preserve">Tarjeta de crédito, PayPal. El checkout actual tiene el flujo preparado para conectarlo</w:t>
-            </w:r>
-          </w:p>
-        </w:tc>
-      </w:tr>
-      <w:tr>
-        <w:tc>
-          <w:tcPr>
-            <w:tcW w:type="dxa" w:w="4320"/>
-          </w:tcPr>
-          <w:p>
-            <w:pPr>
-              <w:spacing w:after="100" w:before="100"/>
-            </w:pPr>
-            <w:r>
-              <w:rPr>
-                <w:rFonts w:ascii="Calibri" w:cs="Calibri" w:eastAsia="Calibri" w:hAnsi="Calibri"/>
-                <w:b/>
-                <w:bCs/>
-                <w:color w:val="0A1628"/>
-                <w:sz w:val="22"/>
-                <w:szCs w:val="22"/>
-              </w:rPr>
-              <w:t xml:space="preserve">CMS de productos</w:t>
-            </w:r>
-          </w:p>
-        </w:tc>
-        <w:tc>
-          <w:tcPr>
-            <w:tcW w:type="dxa" w:w="4320"/>
-          </w:tcPr>
-          <w:p>
-            <w:pPr>
-              <w:spacing w:after="100" w:before="100"/>
-            </w:pPr>
-            <w:r>
-              <w:rPr>
-                <w:rFonts w:ascii="Calibri" w:cs="Calibri" w:eastAsia="Calibri" w:hAnsi="Calibri"/>
-                <w:b w:val="false"/>
-                <w:bCs w:val="false"/>
-                <w:color w:val="111827"/>
-                <w:sz w:val="22"/>
-                <w:szCs w:val="22"/>
-              </w:rPr>
-              <w:t xml:space="preserve">Panel de administración (Sanity) para editar productos, fotos y precios sin tocar código</w:t>
-            </w:r>
-          </w:p>
-        </w:tc>
-      </w:tr>
-      <w:tr>
-        <w:tc>
-          <w:tcPr>
-            <w:tcW w:type="dxa" w:w="4320"/>
-            <w:shd w:fill="EFF6FF" w:color="auto" w:val="clear"/>
-          </w:tcPr>
-          <w:p>
-            <w:pPr>
-              <w:spacing w:after="100" w:before="100"/>
-            </w:pPr>
-            <w:r>
-              <w:rPr>
-                <w:rFonts w:ascii="Calibri" w:cs="Calibri" w:eastAsia="Calibri" w:hAnsi="Calibri"/>
-                <w:b/>
-                <w:bCs/>
-                <w:color w:val="0A1628"/>
-                <w:sz w:val="22"/>
-                <w:szCs w:val="22"/>
-              </w:rPr>
-              <w:t xml:space="preserve">Autenticación real</w:t>
-            </w:r>
-          </w:p>
-        </w:tc>
-        <w:tc>
-          <w:tcPr>
-            <w:tcW w:type="dxa" w:w="4320"/>
-            <w:shd w:fill="EFF6FF" w:color="auto" w:val="clear"/>
-          </w:tcPr>
-          <w:p>
-            <w:pPr>
-              <w:spacing w:after="100" w:before="100"/>
-            </w:pPr>
-            <w:r>
-              <w:rPr>
-                <w:rFonts w:ascii="Calibri" w:cs="Calibri" w:eastAsia="Calibri" w:hAnsi="Calibri"/>
-                <w:b w:val="false"/>
-                <w:bCs w:val="false"/>
-                <w:color w:val="111827"/>
-                <w:sz w:val="22"/>
-                <w:szCs w:val="22"/>
-              </w:rPr>
-              <w:t xml:space="preserve">Registro y login de clientes con sesión persistente (Supabase)</w:t>
+              <w:t xml:space="preserve">Pasarela de pagos (Stripe)</w:t>
+            </w:r>
+          </w:p>
+        </w:tc>
+        <w:tc>
+          <w:tcPr>
+            <w:tcW w:type="dxa" w:w="4320"/>
+            <w:shd w:fill="EFF6FF" w:color="auto" w:val="clear"/>
+          </w:tcPr>
+          <w:p>
+            <w:pPr>
+              <w:spacing w:after="100" w:before="100"/>
+            </w:pPr>
+            <w:r>
+              <w:rPr>
+                <w:rFonts w:ascii="Calibri" w:cs="Calibri" w:eastAsia="Calibri" w:hAnsi="Calibri"/>
+                <w:b w:val="false"/>
+                <w:bCs w:val="false"/>
+                <w:color w:val="111827"/>
+                <w:sz w:val="22"/>
+                <w:szCs w:val="22"/>
+              </w:rPr>
+              <w:t xml:space="preserve">Cobros reales con tarjeta de crédito y PayPal. El flujo de checkout ya está preparado para la integración</w:t>
+            </w:r>
+          </w:p>
+        </w:tc>
+      </w:tr>
+      <w:tr>
+        <w:tc>
+          <w:tcPr>
+            <w:tcW w:type="dxa" w:w="4320"/>
+          </w:tcPr>
+          <w:p>
+            <w:pPr>
+              <w:spacing w:after="100" w:before="100"/>
+            </w:pPr>
+            <w:r>
+              <w:rPr>
+                <w:rFonts w:ascii="Calibri" w:cs="Calibri" w:eastAsia="Calibri" w:hAnsi="Calibri"/>
+                <w:b/>
+                <w:bCs/>
+                <w:color w:val="0A1628"/>
+                <w:sz w:val="22"/>
+                <w:szCs w:val="22"/>
+              </w:rPr>
+              <w:t xml:space="preserve">Panel de administración</w:t>
+            </w:r>
+          </w:p>
+        </w:tc>
+        <w:tc>
+          <w:tcPr>
+            <w:tcW w:type="dxa" w:w="4320"/>
+          </w:tcPr>
+          <w:p>
+            <w:pPr>
+              <w:spacing w:after="100" w:before="100"/>
+            </w:pPr>
+            <w:r>
+              <w:rPr>
+                <w:rFonts w:ascii="Calibri" w:cs="Calibri" w:eastAsia="Calibri" w:hAnsi="Calibri"/>
+                <w:b w:val="false"/>
+                <w:bCs w:val="false"/>
+                <w:color w:val="111827"/>
+                <w:sz w:val="22"/>
+                <w:szCs w:val="22"/>
+              </w:rPr>
+              <w:t xml:space="preserve">CMS con Sanity: editar productos, precios y fotos directamente desde un panel web, sin tocar código</w:t>
+            </w:r>
+          </w:p>
+        </w:tc>
+      </w:tr>
+      <w:tr>
+        <w:tc>
+          <w:tcPr>
+            <w:tcW w:type="dxa" w:w="4320"/>
+            <w:shd w:fill="EFF6FF" w:color="auto" w:val="clear"/>
+          </w:tcPr>
+          <w:p>
+            <w:pPr>
+              <w:spacing w:after="100" w:before="100"/>
+            </w:pPr>
+            <w:r>
+              <w:rPr>
+                <w:rFonts w:ascii="Calibri" w:cs="Calibri" w:eastAsia="Calibri" w:hAnsi="Calibri"/>
+                <w:b/>
+                <w:bCs/>
+                <w:color w:val="0A1628"/>
+                <w:sz w:val="22"/>
+                <w:szCs w:val="22"/>
+              </w:rPr>
+              <w:t xml:space="preserve">Autenticación de clientes</w:t>
+            </w:r>
+          </w:p>
+        </w:tc>
+        <w:tc>
+          <w:tcPr>
+            <w:tcW w:type="dxa" w:w="4320"/>
+            <w:shd w:fill="EFF6FF" w:color="auto" w:val="clear"/>
+          </w:tcPr>
+          <w:p>
+            <w:pPr>
+              <w:spacing w:after="100" w:before="100"/>
+            </w:pPr>
+            <w:r>
+              <w:rPr>
+                <w:rFonts w:ascii="Calibri" w:cs="Calibri" w:eastAsia="Calibri" w:hAnsi="Calibri"/>
+                <w:b w:val="false"/>
+                <w:bCs w:val="false"/>
+                <w:color w:val="111827"/>
+                <w:sz w:val="22"/>
+                <w:szCs w:val="22"/>
+              </w:rPr>
+              <w:t xml:space="preserve">Registro e inicio de sesión real con sesión persistente (Supabase Auth)</w:t>
             </w:r>
           </w:p>
         </w:tc>
@@ -1438,7 +1438,7 @@
                 <w:sz w:val="22"/>
                 <w:szCs w:val="22"/>
               </w:rPr>
-              <w:t xml:space="preserve">Espacio reservado para imágenes reales del cliente vía Sanity CDN (ya configurado)</w:t>
+              <w:t xml:space="preserve">Integración de imágenes reales del cliente vía Sanity CDN (ya configurado en el sitio)</w:t>
             </w:r>
           </w:p>
         </w:tc>

</xml_diff>